<commit_message>
camara: presentismo en el epílogo y prosa integrada en las lecturas
Incorpora la frase "el futuro y el pasado no existen, solo existe el
presente" como contrapunto filosófico al bloque de universo de
Vonnegut en el epílogo. Además disuelve las diez cajas "En física esto
se llama / En la vida diaria es como" de las cinco lecturas en prosa
fluida, y añade una frase de transición antes de "Historia de un
relevo" para suavizar el salto de registro hacia el análisis
futbolístico.
</commit_message>
<xml_diff>
--- a/camara/EHI_el_tiempo_que_no_pasa.docx
+++ b/camara/EHI_el_tiempo_que_no_pasa.docx
@@ -1146,6 +1146,23 @@
           <w:sz w:val="24"/>
           <w:szCs w:val="24"/>
         </w:rPr>
+        <w:t xml:space="preserve">Hay, sin embargo, una diferencia entre lo que la física permite y lo que un horizonte puede de verdad habitar. Los tralfamadorianos ven las cuatro dimensiones a la vez, y la física no les lleva la contraria: pasado, presente y futuro son, en el bloque de universo, igualmente reales. Pero ningún horizonte conocido —ni el tuyo, ni el mío, ni el del archivista en el muelle— puede vivir ahí. El pasado y el futuro no existen para quien integra: existen, como mucho, como memoria y como anticipación, dos formas de presente disfrazadas de otra cosa. Solo existe el presente. Todo lo demás es la manera en que un horizonte, incapaz de visitar su propia lombriz de una sola vez, se cuenta a sí mismo una historia sobre lo que ya no puede tocar y lo que todavía no puede tocar.</w:t>
+      </w:r>
+    </w:p>
+    <w:p>
+      <w:pPr>
+        <w:spacing w:after="200" w:before="0" w:line="340"/>
+      </w:pPr>
+      <w:r>
+        <w:rPr>
+          <w:rFonts w:ascii="Garamond" w:cs="Garamond" w:eastAsia="Garamond" w:hAnsi="Garamond"/>
+          <w:b w:val="false"/>
+          <w:bCs w:val="false"/>
+          <w:i w:val="false"/>
+          <w:iCs w:val="false"/>
+          <w:sz w:val="24"/>
+          <w:szCs w:val="24"/>
+        </w:rPr>
         <w:t xml:space="preserve">Y que, mientras tanto, la orilla te sea suficiente.</w:t>
       </w:r>
     </w:p>
@@ -1574,6 +1591,23 @@
           <w:szCs w:val="24"/>
         </w:rPr>
         <w:t xml:space="preserve">Al final, Noÿs —la mujer de la que Harlan se enamora, que resulta venir de una historia sin Eternidad— lo convence de destruir la organización antes de que llegue a fundarse: no para salvar el futuro que ambos comparten, sino para devolverle a la especie entera el riesgo que la Eternidad le había estado robando, siglo a siglo, sin que nadie lo hubiera votado nunca. Es la paradoja más incómoda que ofrece este capítulo: el horizonte que cree haberse puesto a salvo del tiempo, protegiendo el suyo y el de todos los demás de cualquier daño, puede terminar siendo el único responsable de que ese tiempo, ya sin nada que temer, deje también de tener nada que ganar.</w:t>
+      </w:r>
+    </w:p>
+    <w:p>
+      <w:pPr>
+        <w:spacing w:after="200" w:before="0" w:line="340"/>
+      </w:pPr>
+      <w:r>
+        <w:rPr>
+          <w:rFonts w:ascii="Garamond" w:cs="Garamond" w:eastAsia="Garamond" w:hAnsi="Garamond"/>
+          <w:b w:val="false"/>
+          <w:bCs w:val="false"/>
+          <w:i w:val="false"/>
+          <w:iCs w:val="false"/>
+          <w:sz w:val="24"/>
+          <w:szCs w:val="24"/>
+        </w:rPr>
+        <w:t xml:space="preserve">El resto de este capítulo ha hablado de física y de ficción. La última lectura no necesita ninguna de las dos: solo un balón, un campo, y setenta años de gente real jugando la misma idea.</w:t>
       </w:r>
     </w:p>
     <w:p>

</xml_diff>

<commit_message>
camara: introduce la causalidad en el ensayo
Añade un párrafo tras la introducción del modelo de tasa de
integración: aunque la densidad subjetiva del tiempo varía sin límite,
el orden causal es lo único que ninguna densidad invierte. Conecta la
observación de Hume sobre la causalidad como inferencia, no
percepción, con la invarianza del orden causal en relatividad
especial, y cierra sobre el propio modelo del horizonte: integrar no
es solo recibir información, es incorporarla en el lugar correcto de
una cadena de causas.
</commit_message>
<xml_diff>
--- a/camara/EHI_el_tiempo_que_no_pasa.docx
+++ b/camara/EHI_el_tiempo_que_no_pasa.docx
@@ -592,6 +592,23 @@
           <w:szCs w:val="24"/>
         </w:rPr>
         <w:t xml:space="preserve">Si la conciencia tiene la estructura de un horizonte, su tiempo es una propiedad interna, no un parámetro externo que registra, sino una consecuencia de cómo integra. La tasa de integración del sistema —cuánta información nueva incorpora por unidad de tiempo cronológico— determina la densidad del tiempo subjetivo. Un niño de cuatro años integra a tasa altísima: cada input reconfigura el sistema, cada experiencia es nueva. Por eso una tarde de verano de la infancia tiene una densidad que una tarde adulta rara vez alcanza, no porque el niño sea más feliz, sino porque procesa más por unidad de tiempo. La vejez invierte el proceso: patrones muy consolidados, pocas entradas generan integración nueva. Los ancianos no mienten cuando dicen que el tiempo pasa más rápido. El dolor y el aburrimiento confirman el modelo desde el otro lado: el dolor sobrecarga el sistema con una señal que no se puede procesar ni ignorar, y la integración colapsa sobre sí misma en un bucle que no avanza; el aburrimiento ocurre cuando el sistema no recibe suficiente input para sostener integración, y el horizonte gira en vacío. En ambos casos el tiempo cronológico y el subjetivo se desacoplan de manera dramática —como en un atasco de tráfico, donde las manecillas avanzan pero tú no llegas a ningún sitio—. El flujo, el estado que Csikszentmihalyi documentó en artistas, deportistas y cirujanos, es el caso opuesto: tasa de integración máxima, el sistema absorbe sin fricción, y el tiempo desaparece.</w:t>
+      </w:r>
+    </w:p>
+    <w:p>
+      <w:pPr>
+        <w:spacing w:after="200" w:before="0" w:line="340"/>
+      </w:pPr>
+      <w:r>
+        <w:rPr>
+          <w:rFonts w:ascii="Garamond" w:cs="Garamond" w:eastAsia="Garamond" w:hAnsi="Garamond"/>
+          <w:b w:val="false"/>
+          <w:bCs w:val="false"/>
+          <w:i w:val="false"/>
+          <w:iCs w:val="false"/>
+          <w:sz w:val="24"/>
+          <w:szCs w:val="24"/>
+        </w:rPr>
+        <w:t xml:space="preserve">Pero que la densidad del tiempo varíe tanto no significa que todo en él sea negociable. Hay algo que ninguna densidad, por alta o baja que sea, invierte jamás: el orden causal. David Hume observó hace tres siglos que nunca vemos la causalidad en sí —solo vemos una bola golpear a otra y, después, la segunda moverse; inferimos la causa, no la percibimos—. Y sin embargo ningún horizonte, por más que distorsione la duración, confunde jamás qué bola se movió primero. La física confirma la intuición de Hume por un camino inesperado: la relatividad especial destruye la simultaneidad absoluta —dos observadores en movimiento relativo pueden discrepar sobre qué evento ocurrió antes, si los eventos no están causalmente conectados— pero deja intacto el orden causal. Si un evento puede, en principio, influir sobre otro, todos los observadores, sin excepción, coinciden en cuál fue antes. Lo único que la relatividad protege de la relatividad es la causa. Integrar información, para un horizonte, no es solo recibirla: es incorporarla en el lugar correcto de una cadena de causas, y esa cadena —a diferencia de la duración que produce, de la densidad que genera— no se comprime ni se dilata nunca. Puedes vivir tres horas de conversación como si fueran diez minutos. No puedes vivir el efecto antes que la causa.</w:t>
       </w:r>
     </w:p>
     <w:p>

</xml_diff>

<commit_message>
camara: dilata las lecturas de Mastai, Vonnegut y Asimov
Responde al punto de "aceleración en el análisis de ficción" de la
crítica añadiendo un párrafo contemplativo a cada una de las tres
lecturas más condensadas: un detalle concreto de la novela de Mastai
sobre cómo el horizonte ajeno se filtra gesto a gesto, una escena de
Vonnegut sobre la calma de Billy Pilgrim frente a la incredulidad
ajena, y la imagen final de Asimov sobre el vértigo de un futuro sin
editar. El objetivo es recuperar el ritmo pausado del resto del
capítulo sin perder ningún dato existente.
</commit_message>
<xml_diff>
--- a/camara/EHI_el_tiempo_que_no_pasa.docx
+++ b/camara/EHI_el_tiempo_que_no_pasa.docx
@@ -1465,6 +1465,23 @@
     </w:p>
     <w:p>
       <w:pPr>
+        <w:spacing w:after="200" w:before="0" w:line="340"/>
+      </w:pPr>
+      <w:r>
+        <w:rPr>
+          <w:rFonts w:ascii="Garamond" w:cs="Garamond" w:eastAsia="Garamond" w:hAnsi="Garamond"/>
+          <w:b w:val="false"/>
+          <w:bCs w:val="false"/>
+          <w:i w:val="false"/>
+          <w:iCs w:val="false"/>
+          <w:sz w:val="24"/>
+          <w:szCs w:val="24"/>
+        </w:rPr>
+        <w:t xml:space="preserve">Vale la pena detenerse en un detalle que la novela no subraya, pero que dice más que cualquiera de sus giros: Tom aprende, poco a poco, los gestos de John. Cómo se sirve el café. En qué lado de la cama duerme. El apodo que usa con su hermana. No son datos narrativos: son el horizonte ajeno filtrándose, gesto a gesto, en el suyo, hasta que deja de estar claro dónde termina la imitación y empieza la sustitución. Nadie decide ese tránsito. Simplemente ocurre, de la misma manera en que cualquiera que pasa el tiempo suficiente dentro de una vida que no eligió del todo —un trabajo, una ciudad, una relación heredada— termina hablando, sin darse cuenta, con la voz del papel que ocupa.</w:t>
+      </w:r>
+    </w:p>
+    <w:p>
+      <w:pPr>
         <w:pStyle w:val="Heading3"/>
         <w:spacing w:after="240" w:before="320"/>
       </w:pPr>
@@ -1547,6 +1564,23 @@
     </w:p>
     <w:p>
       <w:pPr>
+        <w:spacing w:after="200" w:before="0" w:line="340"/>
+      </w:pPr>
+      <w:r>
+        <w:rPr>
+          <w:rFonts w:ascii="Garamond" w:cs="Garamond" w:eastAsia="Garamond" w:hAnsi="Garamond"/>
+          <w:b w:val="false"/>
+          <w:bCs w:val="false"/>
+          <w:i w:val="false"/>
+          <w:iCs w:val="false"/>
+          <w:sz w:val="24"/>
+          <w:szCs w:val="24"/>
+        </w:rPr>
+        <w:t xml:space="preserve">Hay una escena que Vonnegut cuenta casi de pasada, sin subrayarla, y que por eso mismo se queda más tiempo del que debería: Billy, ya anciano, cuenta por la radio su secuestro alienígena y nadie le cree, y él no discute ni insiste, sigue hablando con la misma calma con la que describiría el tiempo que hace. No busca convencer a nadie de que el tiempo es una lombriz. Vive como si ya lo supiera, y esa certeza tranquila —ni eufórica ni aterrorizada— es quizás la actitud más honesta que la ficción ha producido frente a un horizonte que ha dejado de controlar el orden de lo que le pasa. So it goes no es resignación: es la frase que le queda a alguien que ha dejado de pedirle permiso al tiempo para doler.</w:t>
+      </w:r>
+    </w:p>
+    <w:p>
+      <w:pPr>
         <w:pStyle w:val="Heading3"/>
         <w:spacing w:after="240" w:before="320"/>
       </w:pPr>
@@ -1608,6 +1642,23 @@
           <w:szCs w:val="24"/>
         </w:rPr>
         <w:t xml:space="preserve">Al final, Noÿs —la mujer de la que Harlan se enamora, que resulta venir de una historia sin Eternidad— lo convence de destruir la organización antes de que llegue a fundarse: no para salvar el futuro que ambos comparten, sino para devolverle a la especie entera el riesgo que la Eternidad le había estado robando, siglo a siglo, sin que nadie lo hubiera votado nunca. Es la paradoja más incómoda que ofrece este capítulo: el horizonte que cree haberse puesto a salvo del tiempo, protegiendo el suyo y el de todos los demás de cualquier daño, puede terminar siendo el único responsable de que ese tiempo, ya sin nada que temer, deje también de tener nada que ganar.</w:t>
+      </w:r>
+    </w:p>
+    <w:p>
+      <w:pPr>
+        <w:spacing w:after="200" w:before="0" w:line="340"/>
+      </w:pPr>
+      <w:r>
+        <w:rPr>
+          <w:rFonts w:ascii="Garamond" w:cs="Garamond" w:eastAsia="Garamond" w:hAnsi="Garamond"/>
+          <w:b w:val="false"/>
+          <w:bCs w:val="false"/>
+          <w:i w:val="false"/>
+          <w:iCs w:val="false"/>
+          <w:sz w:val="24"/>
+          <w:szCs w:val="24"/>
+        </w:rPr>
+        <w:t xml:space="preserve">Conviene quedarse un momento más en la imagen final del libro, porque es la que de verdad paga toda la trama: Harlan, ya fuera de la Eternidad, mirando un futuro que nadie ha editado, sin saber si será mejor o peor que el que acaba de destruir. No hay alivio en esa imagen. Hay, como mucho, el mismo vértigo que siente cualquier horizonte cuando deja de tener un plan de contingencia para todo: la posibilidad, aterradora y necesaria, de que las cosas puedan salir mal de verdad. Asimov no premia a Harlan con un final feliz. Le devuelve, simplemente, el derecho a que su historia —y la de todos los que vendrán después— pueda fracasar.</w:t>
       </w:r>
     </w:p>
     <w:p>

</xml_diff>

<commit_message>
camara: quita la lectura de fútbol de "El tiempo que no pasa"
Elimina "Historia de un relevo" (Cruyff/Guardiola/Messi-Yamal) de las
lecturas del capítulo, siguiendo la crítica recibida: la analogía entre
el estilo Cruyff y la integración informativa resultaba forzada, y el
salto de la física cuántica al fútbol no estaba bien preparado dentro
de esta edición centrada en ficción de viajes en el tiempo.

Ajusta el título y la frase introductoria de la sección ("cinco" pasa
a "cuatro" paradojas), quita la frase de transición que solo existía
para dar paso al fútbol, y renumera el playOrder del toc.ncx del epub.
Verificado que ninguna referencia a Cruyff/Messi/Guardiola/Yamal queda
en epub, docx ni pdf.

Co-Authored-By: Claude Sonnet 5 <noreply@anthropic.com>
Claude-Session: https://claude.ai/code/session_019AT79x34mrYJ7fZoNUs4Pq
</commit_message>
<xml_diff>
--- a/camara/EHI_el_tiempo_que_no_pasa.docx
+++ b/camara/EHI_el_tiempo_que_no_pasa.docx
@@ -1194,24 +1194,24 @@
           <w:b/>
           <w:bCs/>
         </w:rPr>
-        <w:t>Lecturas: cinco paradojas del tiempo</w:t>
-      </w:r>
-    </w:p>
-    <w:p>
-      <w:pPr>
-        <w:spacing w:after="200" w:before="0" w:line="340"/>
-      </w:pPr>
-      <w:r>
-        <w:rPr>
-          <w:rFonts w:ascii="Garamond" w:cs="Garamond" w:eastAsia="Garamond" w:hAnsi="Garamond"/>
-          <w:b w:val="false"/>
-          <w:bCs w:val="false"/>
-          <w:i w:val="false"/>
-          <w:iCs w:val="false"/>
-          <w:sz w:val="24"/>
-          <w:szCs w:val="24"/>
-        </w:rPr>
-        <w:t>Cinco relatos ajenos, sometidos a la misma pregunta que el resto de este libro: qué le pasa al horizonte interior cuando alguien negocia con el tiempo, ya sea cruzándolo hacia atrás, ya sea aterrizando en un cuerpo que no es el suyo, ya sea perdiendo el orden en que le ocurre, ya sea creyendo que puede editar el de los demás sin pagar nada a cambio, ya sea dejándolo pasar de un cuerpo a otro.</w:t>
+        <w:t>Lecturas: cuatro paradojas del tiempo</w:t>
+      </w:r>
+    </w:p>
+    <w:p>
+      <w:pPr>
+        <w:spacing w:after="200" w:before="0" w:line="340"/>
+      </w:pPr>
+      <w:r>
+        <w:rPr>
+          <w:rFonts w:ascii="Garamond" w:cs="Garamond" w:eastAsia="Garamond" w:hAnsi="Garamond"/>
+          <w:b w:val="false"/>
+          <w:bCs w:val="false"/>
+          <w:i w:val="false"/>
+          <w:iCs w:val="false"/>
+          <w:sz w:val="24"/>
+          <w:szCs w:val="24"/>
+        </w:rPr>
+        <w:t>Cuatro relatos ajenos, sometidos a la misma pregunta que el resto de este libro: qué le pasa al horizonte interior cuando alguien negocia con el tiempo, ya sea cruzándolo hacia atrás, ya sea aterrizando en un cuerpo que no es el suyo, ya sea perdiendo el orden en que le ocurre, ya sea creyendo que puede editar el de los demás sin pagar nada a cambio.</w:t>
       </w:r>
     </w:p>
     <w:p>
@@ -1659,139 +1659,6 @@
           <w:szCs w:val="24"/>
         </w:rPr>
         <w:t xml:space="preserve">Conviene quedarse un momento más en la imagen final del libro, porque es la que de verdad paga toda la trama: Harlan, ya fuera de la Eternidad, mirando un futuro que nadie ha editado, sin saber si será mejor o peor que el que acaba de destruir. No hay alivio en esa imagen. Hay, como mucho, el mismo vértigo que siente cualquier horizonte cuando deja de tener un plan de contingencia para todo: la posibilidad, aterradora y necesaria, de que las cosas puedan salir mal de verdad. Asimov no premia a Harlan con un final feliz. Le devuelve, simplemente, el derecho a que su historia —y la de todos los que vendrán después— pueda fracasar.</w:t>
-      </w:r>
-    </w:p>
-    <w:p>
-      <w:pPr>
-        <w:spacing w:after="200" w:before="0" w:line="340"/>
-      </w:pPr>
-      <w:r>
-        <w:rPr>
-          <w:rFonts w:ascii="Garamond" w:cs="Garamond" w:eastAsia="Garamond" w:hAnsi="Garamond"/>
-          <w:b w:val="false"/>
-          <w:bCs w:val="false"/>
-          <w:i w:val="false"/>
-          <w:iCs w:val="false"/>
-          <w:sz w:val="24"/>
-          <w:szCs w:val="24"/>
-        </w:rPr>
-        <w:t xml:space="preserve">El resto de este capítulo ha hablado de física y de ficción. La última lectura no necesita ninguna de las dos: solo un balón, un campo, y setenta años de gente real jugando la misma idea.</w:t>
-      </w:r>
-    </w:p>
-    <w:p>
-      <w:pPr>
-        <w:pStyle w:val="Heading3"/>
-        <w:spacing w:after="240" w:before="320"/>
-      </w:pPr>
-      <w:r>
-        <w:rPr>
-          <w:rFonts w:ascii="Garamond" w:cs="Garamond" w:eastAsia="Garamond" w:hAnsi="Garamond"/>
-          <w:b/>
-          <w:bCs/>
-        </w:rPr>
-        <w:t xml:space="preserve">Historia de un relevo</w:t>
-      </w:r>
-    </w:p>
-    <w:p>
-      <w:pPr>
-        <w:spacing w:after="200" w:before="0" w:line="340"/>
-      </w:pPr>
-      <w:r>
-        <w:rPr>
-          <w:rFonts w:ascii="Garamond" w:cs="Garamond" w:eastAsia="Garamond" w:hAnsi="Garamond"/>
-          <w:b w:val="false"/>
-          <w:bCs w:val="false"/>
-          <w:i w:val="false"/>
-          <w:iCs w:val="false"/>
-          <w:sz w:val="24"/>
-          <w:szCs w:val="24"/>
-        </w:rPr>
-        <w:t xml:space="preserve">Una idea no pesa nada. No ocupa lugar. Y sin embargo, cuando está bien integrada —cuando cada una de sus partes remite a todas las demás y ninguna puede extraerse sin que el conjunto se derrumbe— se comporta como si tuviera masa. Atrae. Curva a su alrededor las trayectorias de quienes se le acercan.</w:t>
-      </w:r>
-    </w:p>
-    <w:p>
-      <w:pPr>
-        <w:spacing w:after="200" w:before="0" w:line="340"/>
-      </w:pPr>
-      <w:r>
-        <w:rPr>
-          <w:rFonts w:ascii="Garamond" w:cs="Garamond" w:eastAsia="Garamond" w:hAnsi="Garamond"/>
-          <w:b w:val="false"/>
-          <w:bCs w:val="false"/>
-          <w:i w:val="false"/>
-          <w:iCs w:val="false"/>
-          <w:sz w:val="24"/>
-          <w:szCs w:val="24"/>
-        </w:rPr>
-        <w:t xml:space="preserve">El 19 de julio de 2026, España ganó su segundo Mundial: un gol en la prórroga, minuto 106, uno a cero. Dieciséis años antes, en Johannesburgo, había ganado el primero: un gol en la prórroga, minuto 116, uno a cero. La simetría no es casual ni es magia. Es lo que ocurre cuando el mismo patrón atraviesa dos cuerpos distintos.</w:t>
-      </w:r>
-    </w:p>
-    <w:p>
-      <w:pPr>
-        <w:spacing w:after="200" w:before="0" w:line="340"/>
-      </w:pPr>
-      <w:r>
-        <w:rPr>
-          <w:rFonts w:ascii="Garamond" w:cs="Garamond" w:eastAsia="Garamond" w:hAnsi="Garamond"/>
-          <w:b w:val="false"/>
-          <w:bCs w:val="false"/>
-          <w:i w:val="false"/>
-          <w:iCs w:val="false"/>
-          <w:sz w:val="24"/>
-          <w:szCs w:val="24"/>
-        </w:rPr>
-        <w:t xml:space="preserve">Conviene fechar el origen. Johan Cruyff llegó a Barcelona en 1973 y, al volver como entrenador en 1988, hizo algo que casi nadie hace: convirtió su intuición en estructura. La Masia dejó de ser una residencia de niños con talento para convertirse en un dispositivo de transmisión, un lugar donde el patrón podía replicarse en cuerpos nuevos antes de que el cuerpo original se apagara. El estilo de Cruyff cumple, con una exactitud incómoda, la definición de un sistema con información integrada: no es una lista de instrucciones que se pueda desmontar pieza a pieza, sino una totalidad donde la presión explica la posesión, la posesión explica la posición. Quítale un elemento y no obtienes el estilo menos ese elemento: obtienes ruido.</w:t>
-      </w:r>
-    </w:p>
-    <w:p>
-      <w:pPr>
-        <w:spacing w:after="200" w:before="0" w:line="340"/>
-      </w:pPr>
-      <w:r>
-        <w:rPr>
-          <w:rFonts w:ascii="Garamond" w:cs="Garamond" w:eastAsia="Garamond" w:hAnsi="Garamond"/>
-          <w:b w:val="false"/>
-          <w:bCs w:val="false"/>
-          <w:i w:val="false"/>
-          <w:iCs w:val="false"/>
-          <w:sz w:val="24"/>
-          <w:szCs w:val="24"/>
-        </w:rPr>
-        <w:t xml:space="preserve">Y como todo sistema con horizonte, plantea la pregunta de una estrella que colapsa: ¿qué sale de ahí? La respuesta física es radiación —información degradada pero no nula, que escapa mientras el sistema se evapora—. La respuesta futbolística es discípulos. Pep Guardiola, formado dentro del horizonte, salió llevando el patrón consigo y, al volver al banquillo en 2008, no inventó: amplificó. El patrón cruzó después un horizonte que no era el suyo —la selección española, colonizada por la idea bajo Vicente del Bosque, ganó Sudáfrica 2010 con la columna vertebral del Barça—. Luis Enrique lo llevó a un triplete en 2015 y a dos Champions con el París Saint-Germain. Xavi, de vuelta al Camp Nou, demostró el reverso de la teoría: Φ no se instala una vez y para siempre, se sostiene, y basta con que quien lo sostiene baje la guardia para que el ruido vuelva a entrar —él mismo lo explicó así tras marcharse en 2024—. Hansi Flick, que no había pisado La Masia en su vida, lo devolvió en su primera temporada: el patrón no exige un canterano, exige solo que alguien aplique la disciplina de la totalidad sin relajarla nunca. Cuando el primer cuerpo envejeció del todo —Xavi se fue, Iniesta se fue, Cruyff murió en 2016—, Luis de la Fuente heredó una generación criada entera dentro del patrón y ganó con ella la Eurocopa de 2024 y el Mundial de 2026.</w:t>
-      </w:r>
-    </w:p>
-    <w:p>
-      <w:pPr>
-        <w:spacing w:after="200" w:before="0" w:line="340"/>
-      </w:pPr>
-      <w:r>
-        <w:rPr>
-          <w:rFonts w:ascii="Garamond" w:cs="Garamond" w:eastAsia="Garamond" w:hAnsi="Garamond"/>
-          <w:b w:val="false"/>
-          <w:bCs w:val="false"/>
-          <w:i w:val="false"/>
-          <w:iCs w:val="false"/>
-          <w:sz w:val="24"/>
-          <w:szCs w:val="24"/>
-        </w:rPr>
-        <w:t xml:space="preserve">Hay una segunda vía de transmisión, más directa, que no necesita institución ni intermediario. En 2007, para un calendario benéfico, un jugador del Barça de veinte años posó bañando a un bebé de meses. El jugador era Lionel Messi. El bebé era Lamine Yamal. Diecinueve años después, esos dos cuerpos volvieron a tocarse: en el césped del MetLife Stadium, minutos después del pitido final, el niño de la fotografía —campeón del mundo a los diecinueve— abrazó al hombre de la fotografía, que acababa de perder la final de su sexto y último Mundial, a los treinta y nueve. Dos partículas que se tocaron una vez quedan correlacionadas para siempre, a cualquier distancia. La distancia, aquí, era temporal: diecinueve años. Messi perdió contra la idea que él mismo había ayudado a transmitir, jugada por un niño al que había bañado. La información no siente lealtad por los cuerpos que atraviesa. Los usa, los agradece a su manera, y sigue.</w:t>
-      </w:r>
-    </w:p>
-    <w:p>
-      <w:pPr>
-        <w:spacing w:after="200" w:before="0" w:line="340"/>
-      </w:pPr>
-      <w:r>
-        <w:rPr>
-          <w:rFonts w:ascii="Garamond" w:cs="Garamond" w:eastAsia="Garamond" w:hAnsi="Garamond"/>
-          <w:b w:val="false"/>
-          <w:bCs w:val="false"/>
-          <w:i w:val="false"/>
-          <w:iCs w:val="false"/>
-          <w:sz w:val="24"/>
-          <w:szCs w:val="24"/>
-        </w:rPr>
-        <w:t xml:space="preserve">Un sistema y un jugador no transmiten la información de la misma manera, y la física, también aquí, ofrece dos mecanismos complementarios: uno lento e institucional, que necesita de alguien dispuesto a diseñar la estructura una y otra vez; otro directo, que basta un contacto para dejar una correlación que ninguna distancia deshace después. Eso es un horizonte interior: aquello que persiste cuando todo lo que lo sostenía se ha evaporado. Lo que de verdad importa de alguien —su manera de mirar, de pensar, de estar en el mundo— no muere con su cuerpo. Se transmite, salta a otros cuerpos, cruza fronteras que no le corresponden. No somos nuestro cuerpo. Somos el patrón que dejamos pasar a través de él.</w:t>
       </w:r>
     </w:p>
     <w:p>

</xml_diff>

<commit_message>
camara: responde al punto de la política ausente en "El tiempo que no pasa"
Añade un párrafo al cierre del Ensayo que reconoce lo que la crítica
señalaba como ausencia significativa: que la densidad temporal no se
reparte igual, y que el modelo de tasa de integración tiene algo que
decir sobre por qué (alerta constante sin novedad real, la falta de
margen para sostener la atención), no solo sobre neuroquímica. Cierra
con un reconocimiento explícito de la posición de quien escribe,
retomando la propia imagen de la crítica ("sentarse bajo un olivo a
medir sombras").

No se actúa sobre el resto de puntos de la crítica (fatiga de la
metáfora "horizonte", el glosario como síntoma, exceso de tesis frente
a exploración): son elecciones autorales consistentes con el resto del
libro real, no defectos locales de esta edición.

Co-Authored-By: Claude Sonnet 5 <noreply@anthropic.com>
Claude-Session: https://claude.ai/code/session_019AT79x34mrYJ7fZoNUs4Pq
</commit_message>
<xml_diff>
--- a/camara/EHI_el_tiempo_que_no_pasa.docx
+++ b/camara/EHI_el_tiempo_que_no_pasa.docx
@@ -728,6 +728,23 @@
           <w:szCs w:val="24"/>
         </w:rPr>
         <w:t>Esta densidad no se mide igual en todas partes. Hay un proverbio senegalés que dice que las personas blancas tienen muchos relojes, pero poco tiempo —una manera precisa de señalar que la abundancia de instrumentos para medir el tiempo no garantiza vivirlo con densidad, y puede incluso indicar lo contrario—. Los maoríes describen el futuro como algo hacia lo que caminamos de espaldas, mirando el pasado que se aleja: no porque el futuro no exista, sino porque nadie ha estado nunca allí para poder mirarlo de frente. El calendario maya, por su parte, nunca asumió que el tiempo fuera una sola línea que se recorre una vez: lo mide con tres ciclos entrelazados a la vez —el Tzolk'in ritual de 260 días, el Haab solar de 365, y la Cuenta Larga que sitúa cualquier fecha dentro de un ciclo de miles de años—, de modo que una fecha no es un punto en una recta, sino la coincidencia particular de varios ritmos que vuelven a repetirse. Ninguna de las tres culturas necesitó la neurociencia para llegar a esta misma conclusión: que el tiempo no es una magnitud universal que todos gastamos igual, sino algo que cada sistema —biológico o cultural— organiza a su manera.</w:t>
+      </w:r>
+    </w:p>
+    <w:p>
+      <w:pPr>
+        <w:spacing w:after="200" w:before="0" w:line="340"/>
+      </w:pPr>
+      <w:r>
+        <w:rPr>
+          <w:rFonts w:ascii="Garamond" w:cs="Garamond" w:eastAsia="Garamond" w:hAnsi="Garamond"/>
+          <w:b w:val="false"/>
+          <w:bCs w:val="false"/>
+          <w:i w:val="false"/>
+          <w:iCs w:val="false"/>
+          <w:sz w:val="24"/>
+          <w:szCs w:val="24"/>
+        </w:rPr>
+        <w:t xml:space="preserve">Conviene decir algo que las páginas anteriores no han dicho: la densidad no se reparte igual. Un repartidor que pedalea nueve horas persiguiendo notificaciones no vive un tiempo lento: vive, casi siempre, el reverso exacto de la integración —alerta constante, atención fragmentada entre pedidos, un reloj externo que corta cada tarea antes de que la anterior termine de asentarse—, y ese régimen puede ser denso en estímulos y, aun así, pobre en la clase de novedad que este modelo llama integración. La densidad temporal no depende solo de neuroquímica: depende también de tener el tiempo, literalmente, disponible para prestarle a algo la atención sostenida que la integración exige. Un horizonte puede llegar con toda su maquinaria biológica intacta y no encontrar nunca el margen —la ausencia de urgencia, el rato que nadie le reclama— que esa maquinaria necesita para funcionar. Quien escribe esto lo hace, conviene decirlo, desde la clase de horizonte que puede permitirse sentarse bajo un olivo a medir sombras.</w:t>
       </w:r>
     </w:p>
     <w:p>

</xml_diff>